<commit_message>
Tried a different approach for the two-stage model.
</commit_message>
<xml_diff>
--- a/Code_Lowie/Development_Report.docx
+++ b/Code_Lowie/Development_Report.docx
@@ -165,7 +165,7 @@
           <w:rFonts w:ascii="Arial" w:hAnsi="Arial"/>
           <w:sz w:val="21"/>
         </w:rPr>
-        <w:t>Key challenge: ~80% of customers churned (revenue = 0 in 2018–2019), making this a highly zero-inflated regression problem</w:t>
+        <w:t>Key challenge: 63.4% of customers churned (revenue = 0 in 2018–2019), making this a highly zero-inflated regression problem</w:t>
       </w:r>
     </w:p>
     <w:p>
@@ -930,13 +930,696 @@
           <w:b/>
           <w:sz w:val="21"/>
         </w:rPr>
-        <w:t>Expected impact:</w:t>
+        <w:t>Results:</w:t>
       </w:r>
       <w:r>
         <w:rPr>
           <w:rFonts w:ascii="Arial" w:hAnsi="Arial"/>
         </w:rPr>
-        <w:t xml:space="preserve"> Expected impact: 0.5–1.5 MAE points. The gap to the professor benchmark is ~1.35 MAE, consistent with a hyperparameter tuning improvement.</w:t>
+        <w:t xml:space="preserve"> Results: MAE 62.45 / Spearman 0.3729 (OOF). All three algorithms converged to the same score — LightGBM 62.58, XGBoost 62.73, CatBoost 62.50, ensemble 62.45. Three independent algorithms returning the same MAE despite very different hyperparameters is a diagnostic signal: the bottleneck is not hyperparameters, it is the information available in the features. The model cannot cleanly separate churners from returners because their feature distributions overlap. More tuning will not close this gap.</w:t>
+      </w:r>
+    </w:p>
+    <w:p>
+      <w:pPr>
+        <w:pStyle w:val="Heading2"/>
+        <w:spacing w:before="280" w:after="80"/>
+      </w:pPr>
+      <w:r>
+        <w:t>2.9  Two-Stage ML: Churn Classifier × Conditional Revenue  (Current)</w:t>
+      </w:r>
+    </w:p>
+    <w:p>
+      <w:pPr>
+        <w:spacing w:after="120"/>
+      </w:pPr>
+      <w:r>
+        <w:rPr>
+          <w:rFonts w:ascii="Arial" w:hAnsi="Arial"/>
+          <w:sz w:val="21"/>
+        </w:rPr>
+        <w:t>Root cause: 63.4% of training customers have exactly €0 revenue yet all single-stage models predict a small positive number for nearly all of them. In log1p space the churner target (log1p(0) = 0) and a low-revenue returner target sit very close together — the decision boundary is inherently blurry. All three Optuna-tuned algorithms converging to MAE ≈ 62.45 confirmed this is a feature-space ceiling, not a hyperparameter problem.</w:t>
+      </w:r>
+    </w:p>
+    <w:p>
+      <w:pPr>
+        <w:spacing w:after="60"/>
+      </w:pPr>
+      <w:r>
+        <w:rPr>
+          <w:rFonts w:ascii="Arial" w:hAnsi="Arial"/>
+          <w:sz w:val="21"/>
+        </w:rPr>
+        <w:t>Architecture:</w:t>
+      </w:r>
+    </w:p>
+    <w:p>
+      <w:pPr>
+        <w:pStyle w:val="ListBullet"/>
+        <w:spacing w:after="60"/>
+      </w:pPr>
+      <w:r>
+        <w:rPr>
+          <w:rFonts w:ascii="Arial" w:hAnsi="Arial"/>
+          <w:b/>
+          <w:sz w:val="21"/>
+        </w:rPr>
+        <w:t>Stage 1 — Churn classifier:</w:t>
+      </w:r>
+      <w:r>
+        <w:rPr>
+          <w:rFonts w:ascii="Arial" w:hAnsi="Arial"/>
+        </w:rPr>
+        <w:t xml:space="preserve"> Stage 1 — Churn classifier: LightGBM binary classifier trained on all customers, all 80+ features. Target: is_returner = (revenue_2018_2019 &gt; 0). Output: P(customer returns in 2018–2019).</w:t>
+      </w:r>
+    </w:p>
+    <w:p>
+      <w:pPr>
+        <w:pStyle w:val="ListBullet"/>
+        <w:spacing w:after="60"/>
+      </w:pPr>
+      <w:r>
+        <w:rPr>
+          <w:rFonts w:ascii="Arial" w:hAnsi="Arial"/>
+          <w:b/>
+          <w:sz w:val="21"/>
+        </w:rPr>
+        <w:t>Stage 2 — Conditional regressor:</w:t>
+      </w:r>
+      <w:r>
+        <w:rPr>
+          <w:rFonts w:ascii="Arial" w:hAnsi="Arial"/>
+        </w:rPr>
+        <w:t xml:space="preserve"> Stage 2 — Conditional regressor: Optuna-tuned LightGBM regressor trained on returning customers only. Target: log1p(revenue). Output: E[revenue | customer is a returner].</w:t>
+      </w:r>
+    </w:p>
+    <w:p>
+      <w:pPr>
+        <w:pStyle w:val="ListBullet"/>
+        <w:spacing w:after="60"/>
+      </w:pPr>
+      <w:r>
+        <w:rPr>
+          <w:rFonts w:ascii="Arial" w:hAnsi="Arial"/>
+          <w:b/>
+          <w:sz w:val="21"/>
+        </w:rPr>
+        <w:t>Combination:</w:t>
+      </w:r>
+      <w:r>
+        <w:rPr>
+          <w:rFonts w:ascii="Arial" w:hAnsi="Arial"/>
+        </w:rPr>
+        <w:t xml:space="preserve"> Combination: prediction = P(return) × conditional_revenue.</w:t>
+      </w:r>
+    </w:p>
+    <w:p>
+      <w:pPr>
+        <w:pStyle w:val="ListBullet"/>
+        <w:spacing w:after="60"/>
+      </w:pPr>
+      <w:r>
+        <w:rPr>
+          <w:rFonts w:ascii="Arial" w:hAnsi="Arial"/>
+          <w:b/>
+          <w:sz w:val="21"/>
+        </w:rPr>
+        <w:t>Optional threshold:</w:t>
+      </w:r>
+      <w:r>
+        <w:rPr>
+          <w:rFonts w:ascii="Arial" w:hAnsi="Arial"/>
+        </w:rPr>
+        <w:t xml:space="preserve"> Optional threshold: an OOF-optimised revenue threshold that zeros out any residual predictions below the break-even level, further reducing churner error.</w:t>
+      </w:r>
+    </w:p>
+    <w:p>
+      <w:pPr>
+        <w:spacing w:after="80"/>
+      </w:pPr>
+      <w:r>
+        <w:rPr>
+          <w:rFonts w:ascii="Arial" w:hAnsi="Arial"/>
+          <w:sz w:val="21"/>
+        </w:rPr>
+        <w:t>Comparison to original two-stage (section 2.1):</w:t>
+      </w:r>
+    </w:p>
+    <w:tbl>
+      <w:tblPr>
+        <w:tblStyle w:val="TableGrid"/>
+        <w:tblW w:type="auto" w:w="0"/>
+        <w:tblLook w:firstColumn="1" w:firstRow="1" w:lastColumn="0" w:lastRow="0" w:noHBand="0" w:noVBand="1" w:val="04A0"/>
+      </w:tblPr>
+      <w:tblGrid>
+        <w:gridCol w:w="3135"/>
+        <w:gridCol w:w="3135"/>
+        <w:gridCol w:w="3135"/>
+      </w:tblGrid>
+      <w:tr>
+        <w:tc>
+          <w:tcPr>
+            <w:tcW w:type="dxa" w:w="2592"/>
+            <w:shd w:val="clear" w:color="auto" w:fill="1F497D"/>
+          </w:tcPr>
+          <w:p>
+            <w:pPr>
+              <w:spacing w:after="0"/>
+            </w:pPr>
+            <w:r>
+              <w:rPr>
+                <w:rFonts w:ascii="Arial" w:hAnsi="Arial"/>
+                <w:b/>
+                <w:color w:val="FFFFFF"/>
+                <w:sz w:val="20"/>
+              </w:rPr>
+              <w:t>Dimension</w:t>
+            </w:r>
+          </w:p>
+        </w:tc>
+        <w:tc>
+          <w:tcPr>
+            <w:tcW w:type="dxa" w:w="3888"/>
+            <w:shd w:val="clear" w:color="auto" w:fill="1F497D"/>
+          </w:tcPr>
+          <w:p>
+            <w:pPr>
+              <w:spacing w:after="0"/>
+            </w:pPr>
+            <w:r>
+              <w:rPr>
+                <w:rFonts w:ascii="Arial" w:hAnsi="Arial"/>
+                <w:b/>
+                <w:color w:val="FFFFFF"/>
+                <w:sz w:val="20"/>
+              </w:rPr>
+              <w:t>Original two-stage (2.1)</w:t>
+            </w:r>
+          </w:p>
+        </w:tc>
+        <w:tc>
+          <w:tcPr>
+            <w:tcW w:type="dxa" w:w="3600"/>
+            <w:shd w:val="clear" w:color="auto" w:fill="1F497D"/>
+          </w:tcPr>
+          <w:p>
+            <w:pPr>
+              <w:spacing w:after="0"/>
+            </w:pPr>
+            <w:r>
+              <w:rPr>
+                <w:rFonts w:ascii="Arial" w:hAnsi="Arial"/>
+                <w:b/>
+                <w:color w:val="FFFFFF"/>
+                <w:sz w:val="20"/>
+              </w:rPr>
+              <w:t>New two-stage (2.9)</w:t>
+            </w:r>
+          </w:p>
+        </w:tc>
+      </w:tr>
+      <w:tr>
+        <w:tc>
+          <w:tcPr>
+            <w:tcW w:type="dxa" w:w="2592"/>
+            <w:shd w:val="clear" w:color="auto" w:fill="EBF3FB"/>
+          </w:tcPr>
+          <w:p>
+            <w:pPr>
+              <w:spacing w:after="0"/>
+            </w:pPr>
+            <w:r>
+              <w:rPr>
+                <w:rFonts w:ascii="Arial" w:hAnsi="Arial"/>
+                <w:sz w:val="19"/>
+              </w:rPr>
+              <w:t>Classifier ensemble</w:t>
+            </w:r>
+          </w:p>
+        </w:tc>
+        <w:tc>
+          <w:tcPr>
+            <w:tcW w:type="dxa" w:w="3888"/>
+            <w:shd w:val="clear" w:color="auto" w:fill="EBF3FB"/>
+          </w:tcPr>
+          <w:p>
+            <w:pPr>
+              <w:spacing w:after="0"/>
+            </w:pPr>
+            <w:r>
+              <w:rPr>
+                <w:rFonts w:ascii="Arial" w:hAnsi="Arial"/>
+                <w:sz w:val="19"/>
+              </w:rPr>
+              <w:t>LGB + XGB + CatBoost (3 models)</w:t>
+            </w:r>
+          </w:p>
+        </w:tc>
+        <w:tc>
+          <w:tcPr>
+            <w:tcW w:type="dxa" w:w="3600"/>
+            <w:shd w:val="clear" w:color="auto" w:fill="EBF3FB"/>
+          </w:tcPr>
+          <w:p>
+            <w:pPr>
+              <w:spacing w:after="0"/>
+            </w:pPr>
+            <w:r>
+              <w:rPr>
+                <w:rFonts w:ascii="Arial" w:hAnsi="Arial"/>
+                <w:sz w:val="19"/>
+              </w:rPr>
+              <w:t>LGB only</w:t>
+            </w:r>
+          </w:p>
+        </w:tc>
+      </w:tr>
+      <w:tr>
+        <w:tc>
+          <w:tcPr>
+            <w:tcW w:type="dxa" w:w="2592"/>
+            <w:shd w:val="clear" w:color="auto" w:fill="FFFFFF"/>
+          </w:tcPr>
+          <w:p>
+            <w:pPr>
+              <w:spacing w:after="0"/>
+            </w:pPr>
+            <w:r>
+              <w:rPr>
+                <w:rFonts w:ascii="Arial" w:hAnsi="Arial"/>
+                <w:sz w:val="19"/>
+              </w:rPr>
+              <w:t>Tuning metric</w:t>
+            </w:r>
+          </w:p>
+        </w:tc>
+        <w:tc>
+          <w:tcPr>
+            <w:tcW w:type="dxa" w:w="3888"/>
+            <w:shd w:val="clear" w:color="auto" w:fill="FFFFFF"/>
+          </w:tcPr>
+          <w:p>
+            <w:pPr>
+              <w:spacing w:after="0"/>
+            </w:pPr>
+            <w:r>
+              <w:rPr>
+                <w:rFonts w:ascii="Arial" w:hAnsi="Arial"/>
+                <w:sz w:val="19"/>
+              </w:rPr>
+              <w:t>AUC — discriminative, not MAE-aligned</w:t>
+            </w:r>
+          </w:p>
+        </w:tc>
+        <w:tc>
+          <w:tcPr>
+            <w:tcW w:type="dxa" w:w="3600"/>
+            <w:shd w:val="clear" w:color="auto" w:fill="FFFFFF"/>
+          </w:tcPr>
+          <w:p>
+            <w:pPr>
+              <w:spacing w:after="0"/>
+            </w:pPr>
+            <w:r>
+              <w:rPr>
+                <w:rFonts w:ascii="Arial" w:hAnsi="Arial"/>
+                <w:sz w:val="19"/>
+              </w:rPr>
+              <w:t>Binary crossentropy + MAE loss</w:t>
+            </w:r>
+          </w:p>
+        </w:tc>
+      </w:tr>
+      <w:tr>
+        <w:tc>
+          <w:tcPr>
+            <w:tcW w:type="dxa" w:w="2592"/>
+            <w:shd w:val="clear" w:color="auto" w:fill="EBF3FB"/>
+          </w:tcPr>
+          <w:p>
+            <w:pPr>
+              <w:spacing w:after="0"/>
+            </w:pPr>
+            <w:r>
+              <w:rPr>
+                <w:rFonts w:ascii="Arial" w:hAnsi="Arial"/>
+                <w:sz w:val="19"/>
+              </w:rPr>
+              <w:t>Prob. calibration</w:t>
+            </w:r>
+          </w:p>
+        </w:tc>
+        <w:tc>
+          <w:tcPr>
+            <w:tcW w:type="dxa" w:w="3888"/>
+            <w:shd w:val="clear" w:color="auto" w:fill="EBF3FB"/>
+          </w:tcPr>
+          <w:p>
+            <w:pPr>
+              <w:spacing w:after="0"/>
+            </w:pPr>
+            <w:r>
+              <w:rPr>
+                <w:rFonts w:ascii="Arial" w:hAnsi="Arial"/>
+                <w:sz w:val="19"/>
+              </w:rPr>
+              <w:t>Isotonic regression on 20% cal set</w:t>
+            </w:r>
+          </w:p>
+        </w:tc>
+        <w:tc>
+          <w:tcPr>
+            <w:tcW w:type="dxa" w:w="3600"/>
+            <w:shd w:val="clear" w:color="auto" w:fill="EBF3FB"/>
+          </w:tcPr>
+          <w:p>
+            <w:pPr>
+              <w:spacing w:after="0"/>
+            </w:pPr>
+            <w:r>
+              <w:rPr>
+                <w:rFonts w:ascii="Arial" w:hAnsi="Arial"/>
+                <w:sz w:val="19"/>
+              </w:rPr>
+              <w:t>None (raw probabilities)</w:t>
+            </w:r>
+          </w:p>
+        </w:tc>
+      </w:tr>
+      <w:tr>
+        <w:tc>
+          <w:tcPr>
+            <w:tcW w:type="dxa" w:w="2592"/>
+            <w:shd w:val="clear" w:color="auto" w:fill="FFFFFF"/>
+          </w:tcPr>
+          <w:p>
+            <w:pPr>
+              <w:spacing w:after="0"/>
+            </w:pPr>
+            <w:r>
+              <w:rPr>
+                <w:rFonts w:ascii="Arial" w:hAnsi="Arial"/>
+                <w:sz w:val="19"/>
+              </w:rPr>
+              <w:t>Class imbalance</w:t>
+            </w:r>
+          </w:p>
+        </w:tc>
+        <w:tc>
+          <w:tcPr>
+            <w:tcW w:type="dxa" w:w="3888"/>
+            <w:shd w:val="clear" w:color="auto" w:fill="FFFFFF"/>
+          </w:tcPr>
+          <w:p>
+            <w:pPr>
+              <w:spacing w:after="0"/>
+            </w:pPr>
+            <w:r>
+              <w:rPr>
+                <w:rFonts w:ascii="Arial" w:hAnsi="Arial"/>
+                <w:sz w:val="19"/>
+              </w:rPr>
+              <w:t>Explicit scale_pos_weight</w:t>
+            </w:r>
+          </w:p>
+        </w:tc>
+        <w:tc>
+          <w:tcPr>
+            <w:tcW w:type="dxa" w:w="3600"/>
+            <w:shd w:val="clear" w:color="auto" w:fill="FFFFFF"/>
+          </w:tcPr>
+          <w:p>
+            <w:pPr>
+              <w:spacing w:after="0"/>
+            </w:pPr>
+            <w:r>
+              <w:rPr>
+                <w:rFonts w:ascii="Arial" w:hAnsi="Arial"/>
+                <w:sz w:val="19"/>
+              </w:rPr>
+              <w:t>Not needed (soft ×, not threshold)</w:t>
+            </w:r>
+          </w:p>
+        </w:tc>
+      </w:tr>
+      <w:tr>
+        <w:tc>
+          <w:tcPr>
+            <w:tcW w:type="dxa" w:w="2592"/>
+            <w:shd w:val="clear" w:color="auto" w:fill="EBF3FB"/>
+          </w:tcPr>
+          <w:p>
+            <w:pPr>
+              <w:spacing w:after="0"/>
+            </w:pPr>
+            <w:r>
+              <w:rPr>
+                <w:rFonts w:ascii="Arial" w:hAnsi="Arial"/>
+                <w:sz w:val="19"/>
+              </w:rPr>
+              <w:t>Decision rule</w:t>
+            </w:r>
+          </w:p>
+        </w:tc>
+        <w:tc>
+          <w:tcPr>
+            <w:tcW w:type="dxa" w:w="3888"/>
+            <w:shd w:val="clear" w:color="auto" w:fill="EBF3FB"/>
+          </w:tcPr>
+          <w:p>
+            <w:pPr>
+              <w:spacing w:after="0"/>
+            </w:pPr>
+            <w:r>
+              <w:rPr>
+                <w:rFonts w:ascii="Arial" w:hAnsi="Arial"/>
+                <w:sz w:val="19"/>
+              </w:rPr>
+              <w:t>Hard: P &gt; threshold → predict, else 0</w:t>
+            </w:r>
+          </w:p>
+        </w:tc>
+        <w:tc>
+          <w:tcPr>
+            <w:tcW w:type="dxa" w:w="3600"/>
+            <w:shd w:val="clear" w:color="auto" w:fill="EBF3FB"/>
+          </w:tcPr>
+          <w:p>
+            <w:pPr>
+              <w:spacing w:after="0"/>
+            </w:pPr>
+            <w:r>
+              <w:rPr>
+                <w:rFonts w:ascii="Arial" w:hAnsi="Arial"/>
+                <w:sz w:val="19"/>
+              </w:rPr>
+              <w:t>Soft: P × conditional_revenue</w:t>
+            </w:r>
+          </w:p>
+        </w:tc>
+      </w:tr>
+      <w:tr>
+        <w:tc>
+          <w:tcPr>
+            <w:tcW w:type="dxa" w:w="2592"/>
+            <w:shd w:val="clear" w:color="auto" w:fill="FFFFFF"/>
+          </w:tcPr>
+          <w:p>
+            <w:pPr>
+              <w:spacing w:after="0"/>
+            </w:pPr>
+            <w:r>
+              <w:rPr>
+                <w:rFonts w:ascii="Arial" w:hAnsi="Arial"/>
+                <w:sz w:val="19"/>
+              </w:rPr>
+              <w:t>Feature set</w:t>
+            </w:r>
+          </w:p>
+        </w:tc>
+        <w:tc>
+          <w:tcPr>
+            <w:tcW w:type="dxa" w:w="3888"/>
+            <w:shd w:val="clear" w:color="auto" w:fill="FFFFFF"/>
+          </w:tcPr>
+          <w:p>
+            <w:pPr>
+              <w:spacing w:after="0"/>
+            </w:pPr>
+            <w:r>
+              <w:rPr>
+                <w:rFonts w:ascii="Arial" w:hAnsi="Arial"/>
+                <w:sz w:val="19"/>
+              </w:rPr>
+              <w:t>customer_features.csv (~51 features)</w:t>
+            </w:r>
+          </w:p>
+        </w:tc>
+        <w:tc>
+          <w:tcPr>
+            <w:tcW w:type="dxa" w:w="3600"/>
+            <w:shd w:val="clear" w:color="auto" w:fill="FFFFFF"/>
+          </w:tcPr>
+          <w:p>
+            <w:pPr>
+              <w:spacing w:after="0"/>
+            </w:pPr>
+            <w:r>
+              <w:rPr>
+                <w:rFonts w:ascii="Arial" w:hAnsi="Arial"/>
+                <w:sz w:val="19"/>
+              </w:rPr>
+              <w:t>customer_features_v3.csv (82 features)</w:t>
+            </w:r>
+          </w:p>
+        </w:tc>
+      </w:tr>
+      <w:tr>
+        <w:tc>
+          <w:tcPr>
+            <w:tcW w:type="dxa" w:w="2592"/>
+            <w:shd w:val="clear" w:color="auto" w:fill="EBF3FB"/>
+          </w:tcPr>
+          <w:p>
+            <w:pPr>
+              <w:spacing w:after="0"/>
+            </w:pPr>
+            <w:r>
+              <w:rPr>
+                <w:rFonts w:ascii="Arial" w:hAnsi="Arial"/>
+                <w:sz w:val="19"/>
+              </w:rPr>
+              <w:t>Stage integration</w:t>
+            </w:r>
+          </w:p>
+        </w:tc>
+        <w:tc>
+          <w:tcPr>
+            <w:tcW w:type="dxa" w:w="3888"/>
+            <w:shd w:val="clear" w:color="auto" w:fill="EBF3FB"/>
+          </w:tcPr>
+          <w:p>
+            <w:pPr>
+              <w:spacing w:after="0"/>
+            </w:pPr>
+            <w:r>
+              <w:rPr>
+                <w:rFonts w:ascii="Arial" w:hAnsi="Arial"/>
+                <w:sz w:val="19"/>
+              </w:rPr>
+              <w:t>Separate notebooks, separate splits —</w:t>
+              <w:br/>
+              <w:t>combined MAE never properly measured</w:t>
+            </w:r>
+          </w:p>
+        </w:tc>
+        <w:tc>
+          <w:tcPr>
+            <w:tcW w:type="dxa" w:w="3600"/>
+            <w:shd w:val="clear" w:color="auto" w:fill="EBF3FB"/>
+          </w:tcPr>
+          <w:p>
+            <w:pPr>
+              <w:spacing w:after="0"/>
+            </w:pPr>
+            <w:r>
+              <w:rPr>
+                <w:rFonts w:ascii="Arial" w:hAnsi="Arial"/>
+                <w:sz w:val="19"/>
+              </w:rPr>
+              <w:t>Both stages inside same 5-fold OOF —</w:t>
+              <w:br/>
+              <w:t>combined MAE directly evaluated</w:t>
+            </w:r>
+          </w:p>
+        </w:tc>
+      </w:tr>
+      <w:tr>
+        <w:tc>
+          <w:tcPr>
+            <w:tcW w:type="dxa" w:w="2592"/>
+            <w:shd w:val="clear" w:color="auto" w:fill="FFFFFF"/>
+          </w:tcPr>
+          <w:p>
+            <w:pPr>
+              <w:spacing w:after="0"/>
+            </w:pPr>
+            <w:r>
+              <w:rPr>
+                <w:rFonts w:ascii="Arial" w:hAnsi="Arial"/>
+                <w:sz w:val="19"/>
+              </w:rPr>
+              <w:t>Evaluation</w:t>
+            </w:r>
+          </w:p>
+        </w:tc>
+        <w:tc>
+          <w:tcPr>
+            <w:tcW w:type="dxa" w:w="3888"/>
+            <w:shd w:val="clear" w:color="auto" w:fill="FFFFFF"/>
+          </w:tcPr>
+          <w:p>
+            <w:pPr>
+              <w:spacing w:after="0"/>
+            </w:pPr>
+            <w:r>
+              <w:rPr>
+                <w:rFonts w:ascii="Arial" w:hAnsi="Arial"/>
+                <w:sz w:val="19"/>
+              </w:rPr>
+              <w:t>AUC (classifier) + MAE (regressor) separately</w:t>
+            </w:r>
+          </w:p>
+        </w:tc>
+        <w:tc>
+          <w:tcPr>
+            <w:tcW w:type="dxa" w:w="3600"/>
+            <w:shd w:val="clear" w:color="auto" w:fill="FFFFFF"/>
+          </w:tcPr>
+          <w:p>
+            <w:pPr>
+              <w:spacing w:after="0"/>
+            </w:pPr>
+            <w:r>
+              <w:rPr>
+                <w:rFonts w:ascii="Arial" w:hAnsi="Arial"/>
+                <w:sz w:val="19"/>
+              </w:rPr>
+              <w:t>Single OOF MAE for P × revenue product</w:t>
+            </w:r>
+          </w:p>
+        </w:tc>
+      </w:tr>
+    </w:tbl>
+    <w:p/>
+    <w:p>
+      <w:pPr>
+        <w:spacing w:after="120"/>
+      </w:pPr>
+      <w:r>
+        <w:rPr>
+          <w:rFonts w:ascii="Arial" w:hAnsi="Arial"/>
+          <w:sz w:val="21"/>
+        </w:rPr>
+        <w:t>Key architectural improvement: The original two-stage never measured the end-to-end MAE of the combined P × revenue prediction in a cross-validated way, because the classifier and regressor lived in separate notebooks with separate train/val splits. Running both stages inside the same OOF fold gives a single honest MAE that is directly comparable to the single-stage baseline.</w:t>
+      </w:r>
+    </w:p>
+    <w:p>
+      <w:pPr>
+        <w:spacing w:after="120"/>
+      </w:pPr>
+      <w:r>
+        <w:rPr>
+          <w:rFonts w:ascii="Arial" w:hAnsi="Arial"/>
+          <w:b/>
+          <w:sz w:val="21"/>
+        </w:rPr>
+        <w:t>Results:</w:t>
+      </w:r>
+      <w:r>
+        <w:rPr>
+          <w:rFonts w:ascii="Arial" w:hAnsi="Arial"/>
+        </w:rPr>
+        <w:t xml:space="preserve"> Results: Pending run.</w:t>
       </w:r>
     </w:p>
     <w:p>
@@ -1501,7 +2184,7 @@
                 <w:rFonts w:ascii="Arial" w:hAnsi="Arial"/>
                 <w:sz w:val="19"/>
               </w:rPr>
-              <w:t>Optuna optimised (current)</w:t>
+              <w:t>Optuna HPO (LGB+XGB+CAT ensemble)</w:t>
             </w:r>
           </w:p>
         </w:tc>
@@ -1519,7 +2202,7 @@
                 <w:rFonts w:ascii="Arial" w:hAnsi="Arial"/>
                 <w:sz w:val="19"/>
               </w:rPr>
-              <w:t>TBD</w:t>
+              <w:t>62.45</w:t>
             </w:r>
           </w:p>
         </w:tc>
@@ -1537,7 +2220,7 @@
                 <w:rFonts w:ascii="Arial" w:hAnsi="Arial"/>
                 <w:sz w:val="19"/>
               </w:rPr>
-              <w:t>TBD</w:t>
+              <w:t>0.3729</w:t>
             </w:r>
           </w:p>
         </w:tc>
@@ -1555,7 +2238,7 @@
                 <w:rFonts w:ascii="Arial" w:hAnsi="Arial"/>
                 <w:sz w:val="19"/>
               </w:rPr>
-              <w:t>Expected best</w:t>
+              <w:t>All 3 algorithms converged → feature ceiling</w:t>
             </w:r>
           </w:p>
         </w:tc>
@@ -1575,7 +2258,7 @@
                 <w:rFonts w:ascii="Arial" w:hAnsi="Arial"/>
                 <w:sz w:val="19"/>
               </w:rPr>
-              <w:t>Professor benchmark</w:t>
+              <w:t>Two-stage ML (clf × regressor)</w:t>
             </w:r>
           </w:p>
         </w:tc>
@@ -1593,7 +2276,7 @@
                 <w:rFonts w:ascii="Arial" w:hAnsi="Arial"/>
                 <w:sz w:val="19"/>
               </w:rPr>
-              <w:t>61.146</w:t>
+              <w:t>TBD</w:t>
             </w:r>
           </w:p>
         </w:tc>
@@ -1611,6 +2294,80 @@
                 <w:rFonts w:ascii="Arial" w:hAnsi="Arial"/>
                 <w:sz w:val="19"/>
               </w:rPr>
+              <w:t>TBD</w:t>
+            </w:r>
+          </w:p>
+        </w:tc>
+        <w:tc>
+          <w:tcPr>
+            <w:tcW w:type="dxa" w:w="3456"/>
+            <w:shd w:val="clear" w:color="auto" w:fill="FFFFFF"/>
+          </w:tcPr>
+          <w:p>
+            <w:pPr>
+              <w:spacing w:after="0"/>
+            </w:pPr>
+            <w:r>
+              <w:rPr>
+                <w:rFonts w:ascii="Arial" w:hAnsi="Arial"/>
+                <w:sz w:val="19"/>
+              </w:rPr>
+              <w:t>Run pending</w:t>
+            </w:r>
+          </w:p>
+        </w:tc>
+      </w:tr>
+      <w:tr>
+        <w:tc>
+          <w:tcPr>
+            <w:tcW w:type="dxa" w:w="4032"/>
+            <w:shd w:val="clear" w:color="auto" w:fill="EBF3FB"/>
+          </w:tcPr>
+          <w:p>
+            <w:pPr>
+              <w:spacing w:after="0"/>
+            </w:pPr>
+            <w:r>
+              <w:rPr>
+                <w:rFonts w:ascii="Arial" w:hAnsi="Arial"/>
+                <w:sz w:val="19"/>
+              </w:rPr>
+              <w:t>Professor benchmark</w:t>
+            </w:r>
+          </w:p>
+        </w:tc>
+        <w:tc>
+          <w:tcPr>
+            <w:tcW w:type="dxa" w:w="1296"/>
+            <w:shd w:val="clear" w:color="auto" w:fill="EBF3FB"/>
+          </w:tcPr>
+          <w:p>
+            <w:pPr>
+              <w:spacing w:after="0"/>
+            </w:pPr>
+            <w:r>
+              <w:rPr>
+                <w:rFonts w:ascii="Arial" w:hAnsi="Arial"/>
+                <w:sz w:val="19"/>
+              </w:rPr>
+              <w:t>61.146</w:t>
+            </w:r>
+          </w:p>
+        </w:tc>
+        <w:tc>
+          <w:tcPr>
+            <w:tcW w:type="dxa" w:w="1296"/>
+            <w:shd w:val="clear" w:color="auto" w:fill="EBF3FB"/>
+          </w:tcPr>
+          <w:p>
+            <w:pPr>
+              <w:spacing w:after="0"/>
+            </w:pPr>
+            <w:r>
+              <w:rPr>
+                <w:rFonts w:ascii="Arial" w:hAnsi="Arial"/>
+                <w:sz w:val="19"/>
+              </w:rPr>
               <w:t>0.41</w:t>
             </w:r>
           </w:p>
@@ -1618,7 +2375,7 @@
         <w:tc>
           <w:tcPr>
             <w:tcW w:type="dxa" w:w="3456"/>
-            <w:shd w:val="clear" w:color="auto" w:fill="FFFFFF"/>
+            <w:shd w:val="clear" w:color="auto" w:fill="EBF3FB"/>
           </w:tcPr>
           <w:p>
             <w:pPr>
@@ -2428,7 +3185,7 @@
                 <w:rFonts w:ascii="Arial" w:hAnsi="Arial"/>
                 <w:sz w:val="19"/>
               </w:rPr>
-              <w:t>Optuna HPO, 5-fold OOF, Nelder-Mead ensemble, soft scaling comparison, retrain, save</w:t>
+              <w:t>Optuna HPO, 5-fold OOF, Nelder-Mead ensemble, soft scaling comparison, two-stage ML (classifier × regressor, OOF-integrated), retrain all models, save</w:t>
             </w:r>
           </w:p>
         </w:tc>
@@ -2638,6 +3395,46 @@
           <w:sz w:val="21"/>
         </w:rPr>
         <w:t>40 random trials cover a tiny fraction of a high-dimensional space. Optuna TPE makes each trial informative for the next.</w:t>
+      </w:r>
+    </w:p>
+    <w:p>
+      <w:pPr>
+        <w:spacing w:after="120"/>
+      </w:pPr>
+      <w:r>
+        <w:rPr>
+          <w:rFonts w:ascii="Arial" w:hAnsi="Arial"/>
+          <w:b/>
+          <w:sz w:val="21"/>
+        </w:rPr>
+        <w:t xml:space="preserve">7.  Algorithm convergence is a ceiling signal: </w:t>
+      </w:r>
+      <w:r>
+        <w:rPr>
+          <w:rFonts w:ascii="Arial" w:hAnsi="Arial"/>
+          <w:sz w:val="21"/>
+        </w:rPr>
+        <w:t>When LightGBM, XGBoost, and CatBoost all return the same OOF MAE after independent Optuna searches, further tuning will not help — the bottleneck is the feature space, not the model. The right response is an architectural change, not more trials.</w:t>
+      </w:r>
+    </w:p>
+    <w:p>
+      <w:pPr>
+        <w:spacing w:after="120"/>
+      </w:pPr>
+      <w:r>
+        <w:rPr>
+          <w:rFonts w:ascii="Arial" w:hAnsi="Arial"/>
+          <w:b/>
+          <w:sz w:val="21"/>
+        </w:rPr>
+        <w:t xml:space="preserve">8.  OOF integration is critical for honest two-stage evaluation: </w:t>
+      </w:r>
+      <w:r>
+        <w:rPr>
+          <w:rFonts w:ascii="Arial" w:hAnsi="Arial"/>
+          <w:sz w:val="21"/>
+        </w:rPr>
+        <w:t>The original two-stage used separate train/val splits for the classifier and regressor, so the combined P × revenue MAE was never properly measured. Only by running both stages inside the same OOF fold can the combined prediction be compared apples-to-apples against a single-stage baseline.</w:t>
       </w:r>
     </w:p>
     <w:sectPr>

</xml_diff>